<commit_message>
CS1105 Unit 7: APA no-author citations, efficiency analysis, fix 2**31 rendering in docx
Co-Authored-By: Claude Opus 5.5 <noreply@anthropic.com>
</commit_message>
<xml_diff>
--- a/CS1105_Digital_Electronics_Architecture/Unit7_Assembler_Language/Assignment/Unit7_Assignment_Activity.docx
+++ b/CS1105_Digital_Electronics_Architecture/Unit7_Assembler_Language/Assignment/Unit7_Assignment_Activity.docx
@@ -163,7 +163,25 @@
           <w:i w:val="0"/>
           <w:sz w:val="24"/>
         </w:rPr>
-        <w:t>A stack is one of the simplest high-level data structures: items are added and removed only at the top, so the last item in is the first item out (LIFO). In a language like Java or Python a stack is one line of code, but the processor has no "stack object". It only has registers, memory addresses, and instructions. For this assignment I built a stack by hand in x86 assembly language and used it to solve three classic problems: reversing a string, testing whether a string is a palindrome, and checking that the brackets ( ), [ ], and { } in a line of text are balanced. The program was written for NASM, the assembler used in the asmtutor.com tutorials from this unit's readings, and runs as a 32-bit Linux program (NASM Assembly Language Tutorials, n.d.).</w:t>
+        <w:t>A stack is one of the simplest high-level data structures: items are added and removed only at the top, so the last item in is the first item out (LIFO). In a language like Java or Python a stack is one line of code, but the processor has no "stack object". It only has registers, memory addresses, and instructions. For this assignment I built a stack by hand in x86 assembly language and used it to solve three classic problems: reversing a string, testing whether a string is a palindrome, and checking that the brackets ( ), [ ], and { } in a line of text are balanced. The program was written for NASM, the assembler used in the asmtutor.com tutorials from this unit's readings, and runs as a 32-bit Linux program (</w:t>
+      </w:r>
+      <w:r>
+        <w:rPr>
+          <w:rFonts w:ascii="Times New Roman" w:hAnsi="Times New Roman"/>
+          <w:b w:val="0"/>
+          <w:i/>
+          <w:sz w:val="24"/>
+        </w:rPr>
+        <w:t>NASM Assembly Language Tutorials</w:t>
+      </w:r>
+      <w:r>
+        <w:rPr>
+          <w:rFonts w:ascii="Times New Roman" w:hAnsi="Times New Roman"/>
+          <w:b w:val="0"/>
+          <w:i w:val="0"/>
+          <w:sz w:val="24"/>
+        </w:rPr>
+        <w:t>, n.d.).</w:t>
       </w:r>
     </w:p>
     <w:p>
@@ -2774,7 +2792,7 @@
     </w:p>
     <w:p>
       <w:pPr>
-        <w:pStyle w:val="Heading1"/>
+        <w:pStyle w:val="Heading2"/>
         <w:jc w:val="left"/>
       </w:pPr>
       <w:r>
@@ -2784,12 +2802,111 @@
           <w:color w:val="000000"/>
           <w:sz w:val="24"/>
         </w:rPr>
-        <w:t>Part 2: Design and Development Process</w:t>
-      </w:r>
-    </w:p>
-    <w:p>
-      <w:pPr>
-        <w:pStyle w:val="Heading2"/>
+        <w:t>Efficiency of the Design</w:t>
+      </w:r>
+    </w:p>
+    <w:p>
+      <w:pPr>
+        <w:spacing w:line="360" w:lineRule="auto" w:after="0"/>
+        <w:ind w:left="720" w:hanging="360"/>
+      </w:pPr>
+      <w:r>
+        <w:rPr>
+          <w:rFonts w:ascii="Times New Roman" w:hAnsi="Times New Roman"/>
+          <w:b w:val="0"/>
+          <w:i w:val="0"/>
+          <w:sz w:val="24"/>
+        </w:rPr>
+        <w:t xml:space="preserve">•  </w:t>
+      </w:r>
+      <w:r>
+        <w:rPr>
+          <w:rFonts w:ascii="Times New Roman" w:hAnsi="Times New Roman"/>
+          <w:b/>
+          <w:i w:val="0"/>
+          <w:sz w:val="24"/>
+        </w:rPr>
+        <w:t>Time.</w:t>
+      </w:r>
+      <w:r>
+        <w:rPr>
+          <w:rFonts w:ascii="Times New Roman" w:hAnsi="Times New Roman"/>
+          <w:b w:val="0"/>
+          <w:i w:val="0"/>
+          <w:sz w:val="24"/>
+        </w:rPr>
+        <w:t xml:space="preserve"> Each character is read exactly once, and every push and pop takes constant time. On the success path, stack_push and stack_pop each execute exactly 10 instructions (7 when they report an error), which I confirmed by disassembling the program with objdump. All three problems therefore run in linear time, O(n), in the length of the string.</w:t>
+      </w:r>
+    </w:p>
+    <w:p>
+      <w:pPr>
+        <w:spacing w:line="360" w:lineRule="auto" w:after="0"/>
+        <w:ind w:left="720" w:hanging="360"/>
+      </w:pPr>
+      <w:r>
+        <w:rPr>
+          <w:rFonts w:ascii="Times New Roman" w:hAnsi="Times New Roman"/>
+          <w:b w:val="0"/>
+          <w:i w:val="0"/>
+          <w:sz w:val="24"/>
+        </w:rPr>
+        <w:t xml:space="preserve">•  </w:t>
+      </w:r>
+      <w:r>
+        <w:rPr>
+          <w:rFonts w:ascii="Times New Roman" w:hAnsi="Times New Roman"/>
+          <w:b/>
+          <w:i w:val="0"/>
+          <w:sz w:val="24"/>
+        </w:rPr>
+        <w:t>Memory.</w:t>
+      </w:r>
+      <w:r>
+        <w:rPr>
+          <w:rFonts w:ascii="Times New Roman" w:hAnsi="Times New Roman"/>
+          <w:b w:val="0"/>
+          <w:i w:val="0"/>
+          <w:sz w:val="24"/>
+        </w:rPr>
+        <w:t xml:space="preserve"> The stack uses a fixed 68 bytes and the reversed copy a fixed 65 bytes. There is no heap allocation, and the input string is never copied.</w:t>
+      </w:r>
+    </w:p>
+    <w:p>
+      <w:pPr>
+        <w:spacing w:line="360" w:lineRule="auto" w:after="0"/>
+        <w:ind w:left="720" w:hanging="360"/>
+      </w:pPr>
+      <w:r>
+        <w:rPr>
+          <w:rFonts w:ascii="Times New Roman" w:hAnsi="Times New Roman"/>
+          <w:b w:val="0"/>
+          <w:i w:val="0"/>
+          <w:sz w:val="24"/>
+        </w:rPr>
+        <w:t xml:space="preserve">•  </w:t>
+      </w:r>
+      <w:r>
+        <w:rPr>
+          <w:rFonts w:ascii="Times New Roman" w:hAnsi="Times New Roman"/>
+          <w:b/>
+          <w:i w:val="0"/>
+          <w:sz w:val="24"/>
+        </w:rPr>
+        <w:t>Small choices that add up.</w:t>
+      </w:r>
+      <w:r>
+        <w:rPr>
+          <w:rFonts w:ascii="Times New Roman" w:hAnsi="Times New Roman"/>
+          <w:b w:val="0"/>
+          <w:i w:val="0"/>
+          <w:sz w:val="24"/>
+        </w:rPr>
+        <w:t xml:space="preserve"> Loop variables stay in registers (ESI for the string pointer, ECX for the position) instead of memory. Errors are reported in the carry flag, so checking one costs a single jc instruction. The palindrome test reuses the reversed copy instead of running the stack a second time, and check_brackets stops at the first error instead of scanning the rest of the string.</w:t>
+      </w:r>
+    </w:p>
+    <w:p>
+      <w:pPr>
+        <w:pStyle w:val="Heading1"/>
         <w:jc w:val="left"/>
       </w:pPr>
       <w:r>
@@ -2799,6 +2916,21 @@
           <w:color w:val="000000"/>
           <w:sz w:val="24"/>
         </w:rPr>
+        <w:t>Part 2: Design and Development Process</w:t>
+      </w:r>
+    </w:p>
+    <w:p>
+      <w:pPr>
+        <w:pStyle w:val="Heading2"/>
+        <w:jc w:val="left"/>
+      </w:pPr>
+      <w:r>
+        <w:rPr>
+          <w:rFonts w:ascii="Times New Roman" w:hAnsi="Times New Roman"/>
+          <w:b/>
+          <w:color w:val="000000"/>
+          <w:sz w:val="24"/>
+        </w:rPr>
         <w:t>Step 1: Defining the Problem and Choosing the Structure</w:t>
       </w:r>
     </w:p>
@@ -2842,7 +2974,25 @@
           <w:i w:val="0"/>
           <w:sz w:val="24"/>
         </w:rPr>
-        <w:t>I chose NASM on 32-bit x86 Linux because it matches the asmtutor.com lessons in our reading list, which use the same build commands (nasm -f elf, then ld -m elf_i386) and the same int 80h system calls for output and exit (NASM Assembly Language Tutorials, n.d.). The assembler translates each mnemonic, such as mov or cmp, into machine code (Assembly language, 2021), and the linker then turns that object file into a program the operating system can run.</w:t>
+        <w:t>I chose NASM on 32-bit x86 Linux because it matches the asmtutor.com lessons in our reading list, which use the same build commands (nasm -f elf, then ld -m elf_i386) and the same int 80h system calls for output and exit (</w:t>
+      </w:r>
+      <w:r>
+        <w:rPr>
+          <w:rFonts w:ascii="Times New Roman" w:hAnsi="Times New Roman"/>
+          <w:b w:val="0"/>
+          <w:i/>
+          <w:sz w:val="24"/>
+        </w:rPr>
+        <w:t>NASM Assembly Language Tutorials</w:t>
+      </w:r>
+      <w:r>
+        <w:rPr>
+          <w:rFonts w:ascii="Times New Roman" w:hAnsi="Times New Roman"/>
+          <w:b w:val="0"/>
+          <w:i w:val="0"/>
+          <w:sz w:val="24"/>
+        </w:rPr>
+        <w:t>, n.d.). The assembler translates each mnemonic, such as mov or cmp, into machine code ("Assembly Language," 2021), and the linker then turns that object file into a program the operating system can run.</w:t>
       </w:r>
     </w:p>
     <w:p>
@@ -4313,14 +4463,17 @@
           <w:i w:val="0"/>
           <w:sz w:val="24"/>
         </w:rPr>
-        <w:t xml:space="preserve"> Printing one line means loading a system call number into EAX, the arguments into EBX, ECX, and EDX, and executing int 80h (NASM Assembly Language Tutorials, n.d.).</w:t>
-      </w:r>
-    </w:p>
-    <w:p>
-      <w:pPr>
-        <w:spacing w:line="360" w:lineRule="auto" w:after="0"/>
-        <w:ind w:left="720" w:hanging="360"/>
-      </w:pPr>
+        <w:t xml:space="preserve"> Printing one line means loading a system call number into EAX, the arguments into EBX, ECX, and EDX, and executing int 80h (</w:t>
+      </w:r>
+      <w:r>
+        <w:rPr>
+          <w:rFonts w:ascii="Times New Roman" w:hAnsi="Times New Roman"/>
+          <w:b w:val="0"/>
+          <w:i/>
+          <w:sz w:val="24"/>
+        </w:rPr>
+        <w:t>NASM Assembly Language Tutorials</w:t>
+      </w:r>
       <w:r>
         <w:rPr>
           <w:rFonts w:ascii="Times New Roman" w:hAnsi="Times New Roman"/>
@@ -4328,6 +4481,21 @@
           <w:i w:val="0"/>
           <w:sz w:val="24"/>
         </w:rPr>
+        <w:t>, n.d.).</w:t>
+      </w:r>
+    </w:p>
+    <w:p>
+      <w:pPr>
+        <w:spacing w:line="360" w:lineRule="auto" w:after="0"/>
+        <w:ind w:left="720" w:hanging="360"/>
+      </w:pPr>
+      <w:r>
+        <w:rPr>
+          <w:rFonts w:ascii="Times New Roman" w:hAnsi="Times New Roman"/>
+          <w:b w:val="0"/>
+          <w:i w:val="0"/>
+          <w:sz w:val="24"/>
+        </w:rPr>
         <w:t xml:space="preserve">•  </w:t>
       </w:r>
       <w:r>
@@ -4384,7 +4552,7 @@
           <w:i w:val="0"/>
           <w:sz w:val="24"/>
         </w:rPr>
-        <w:t xml:space="preserve"> In assembly I decide exactly where every byte lives and how big the structure is: 64 bytes of items and a 4-byte counter, with no object headers and no hidden allocation. This matters most on small embedded devices. Mahout (2012) teaches these structures on the ARM Cortex-M3, a microcontroller core, where memory is measured in kilobytes and every byte counts.</w:t>
+        <w:t xml:space="preserve"> In assembly I decide exactly where every byte lives and how big the structure is: 64 bytes of items and a 4-byte counter, with no object headers and no hidden allocation. This matters most on small embedded devices. Mahout (2012) teaches these structures on the ARM Cortex-M3, a processor core built for microcontrollers, where memory is small and has to be planned byte by byte.</w:t>
       </w:r>
     </w:p>
     <w:p>
@@ -4407,7 +4575,7 @@
           <w:i w:val="0"/>
           <w:sz w:val="24"/>
         </w:rPr>
-        <w:t xml:space="preserve"> A push in my program is about ten instructions with no function-call overhead beyond call and ret, and its running time is the same every time. Assembly is still used where timing is critical, such as device drivers, interrupt handlers, and real-time systems, where an interrupt may fire thousands of times per second and must finish in as few cycles as possible (Assembly language, 2021). Thakkar (2022) also points out that a few programmers still pick assembly for short programs where every bit of execution speed counts.</w:t>
+        <w:t xml:space="preserve"> A push in my program is about ten instructions with no function-call overhead beyond call and ret, and its running time is the same every time. Assembly is still used where timing is critical, such as device drivers, interrupt handlers, and real-time systems, where an interrupt may fire thousands of times per second and must finish in as few cycles as possible ("Assembly Language," 2021). Thakkar (2022) also points out that a few programmers still pick assembly for short programs where every bit of execution speed counts.</w:t>
       </w:r>
     </w:p>
     <w:p>
@@ -4430,7 +4598,7 @@
           <w:i w:val="0"/>
           <w:sz w:val="24"/>
         </w:rPr>
-        <w:t xml:space="preserve"> My hand-written stack_push is 31 bytes of machine code. The same logic written in C and compiled by GCC with -O2 came to 40 bytes, mostly because the compiler has to pass the argument through memory to follow the calling convention. The gap is small, which shows how good modern compilers are, but in boot code or firmware stored in a small ROM those bytes add up. Assembly is still typically used for boot code that runs before the operating system starts (Assembly language, 2021).</w:t>
+        <w:t xml:space="preserve"> My hand-written stack_push is 31 bytes of machine code. The same logic written in C and compiled by GCC with -O2 came to 40 bytes, mostly because the compiler has to pass the argument through memory to follow the calling convention. The gap is small, which shows how good modern compilers are, but in boot code or firmware stored in a small ROM those bytes add up. Assembly is still typically used for boot code that runs before the operating system starts ("Assembly Language," 2021).</w:t>
       </w:r>
     </w:p>
     <w:p>
@@ -4453,7 +4621,7 @@
           <w:i w:val="0"/>
           <w:sz w:val="24"/>
         </w:rPr>
-        <w:t xml:space="preserve"> I used the carry flag as a cheap error signal, which C or Java cannot do directly. Real systems use this kind of access too. The Linux kernel's memcpy, the routine that copies blocks of memory for the whole operating system, is written in x86 assembly so it can use the rep movsb string instruction directly (Linux kernel developers, n.d.). Encryption code is another example, because it relies on bit rotation instructions that many compilers do not expose (Assembly language, 2021).</w:t>
+        <w:t xml:space="preserve"> I used the carry flag as a cheap error signal, which C or Java cannot do directly. Real systems use this kind of access too. The Linux kernel's memcpy, the routine that copies blocks of memory for the whole operating system, is written in x86 assembly so it can use the rep movsb string instruction directly (Linux kernel developers, n.d.). Encryption code is another example, because it relies on bit rotation instructions that many compilers do not expose ("Assembly Language," 2021).</w:t>
       </w:r>
     </w:p>
     <w:p>
@@ -5679,6 +5847,240 @@
           <w:rFonts w:ascii="Courier New" w:hAnsi="Courier New"/>
           <w:sz w:val="16"/>
         </w:rPr>
+        <w:t xml:space="preserve">    clc                             ; CF = 0: success</w:t>
+      </w:r>
+    </w:p>
+    <w:p>
+      <w:pPr>
+        <w:spacing w:line="240" w:lineRule="auto" w:after="0"/>
+        <w:ind w:left="432"/>
+      </w:pPr>
+      <w:r>
+        <w:rPr>
+          <w:rFonts w:ascii="Courier New" w:hAnsi="Courier New"/>
+          <w:sz w:val="16"/>
+        </w:rPr>
+        <w:t xml:space="preserve">    pop     ebx</w:t>
+      </w:r>
+    </w:p>
+    <w:p>
+      <w:pPr>
+        <w:spacing w:line="240" w:lineRule="auto" w:after="0"/>
+        <w:ind w:left="432"/>
+      </w:pPr>
+      <w:r>
+        <w:rPr>
+          <w:rFonts w:ascii="Courier New" w:hAnsi="Courier New"/>
+          <w:sz w:val="16"/>
+        </w:rPr>
+        <w:t xml:space="preserve">    ret</w:t>
+      </w:r>
+    </w:p>
+    <w:p>
+      <w:pPr>
+        <w:spacing w:line="240" w:lineRule="auto" w:after="0"/>
+        <w:ind w:left="432"/>
+      </w:pPr>
+      <w:r>
+        <w:rPr>
+          <w:rFonts w:ascii="Courier New" w:hAnsi="Courier New"/>
+          <w:sz w:val="16"/>
+        </w:rPr>
+        <w:t>.full:</w:t>
+      </w:r>
+    </w:p>
+    <w:p>
+      <w:pPr>
+        <w:spacing w:line="240" w:lineRule="auto" w:after="0"/>
+        <w:ind w:left="432"/>
+      </w:pPr>
+      <w:r>
+        <w:rPr>
+          <w:rFonts w:ascii="Courier New" w:hAnsi="Courier New"/>
+          <w:sz w:val="16"/>
+        </w:rPr>
+        <w:t xml:space="preserve">    stc                             ; CF = 1: overflow</w:t>
+      </w:r>
+    </w:p>
+    <w:p>
+      <w:pPr>
+        <w:spacing w:line="240" w:lineRule="auto" w:after="0"/>
+        <w:ind w:left="432"/>
+      </w:pPr>
+      <w:r>
+        <w:rPr>
+          <w:rFonts w:ascii="Courier New" w:hAnsi="Courier New"/>
+          <w:sz w:val="16"/>
+        </w:rPr>
+        <w:t xml:space="preserve">    pop     ebx</w:t>
+      </w:r>
+    </w:p>
+    <w:p>
+      <w:pPr>
+        <w:spacing w:line="240" w:lineRule="auto" w:after="0"/>
+        <w:ind w:left="432"/>
+      </w:pPr>
+      <w:r>
+        <w:rPr>
+          <w:rFonts w:ascii="Courier New" w:hAnsi="Courier New"/>
+          <w:sz w:val="16"/>
+        </w:rPr>
+        <w:t xml:space="preserve">    ret</w:t>
+      </w:r>
+    </w:p>
+    <w:p>
+      <w:pPr>
+        <w:spacing w:line="240" w:lineRule="auto" w:after="0"/>
+        <w:ind w:left="432"/>
+      </w:pPr>
+      <w:r>
+        <w:rPr>
+          <w:rFonts w:ascii="Courier New" w:hAnsi="Courier New"/>
+          <w:sz w:val="16"/>
+        </w:rPr>
+        <w:t xml:space="preserve"> </w:t>
+      </w:r>
+    </w:p>
+    <w:p>
+      <w:pPr>
+        <w:spacing w:line="240" w:lineRule="auto" w:after="0"/>
+        <w:ind w:left="432"/>
+      </w:pPr>
+      <w:r>
+        <w:rPr>
+          <w:rFonts w:ascii="Courier New" w:hAnsi="Courier New"/>
+          <w:sz w:val="16"/>
+        </w:rPr>
+        <w:t>; stack_pop: remove the top byte and return it in AL (AH is not changed).</w:t>
+      </w:r>
+    </w:p>
+    <w:p>
+      <w:pPr>
+        <w:spacing w:line="240" w:lineRule="auto" w:after="0"/>
+        <w:ind w:left="432"/>
+      </w:pPr>
+      <w:r>
+        <w:rPr>
+          <w:rFonts w:ascii="Courier New" w:hAnsi="Courier New"/>
+          <w:sz w:val="16"/>
+        </w:rPr>
+        <w:t>; Out: CF = 1 if the stack is empty (underflow), otherwise CF = 0.</w:t>
+      </w:r>
+    </w:p>
+    <w:p>
+      <w:pPr>
+        <w:spacing w:line="240" w:lineRule="auto" w:after="0"/>
+        <w:ind w:left="432"/>
+      </w:pPr>
+      <w:r>
+        <w:rPr>
+          <w:rFonts w:ascii="Courier New" w:hAnsi="Courier New"/>
+          <w:sz w:val="16"/>
+        </w:rPr>
+        <w:t>stack_pop:</w:t>
+      </w:r>
+    </w:p>
+    <w:p>
+      <w:pPr>
+        <w:spacing w:line="240" w:lineRule="auto" w:after="0"/>
+        <w:ind w:left="432"/>
+      </w:pPr>
+      <w:r>
+        <w:rPr>
+          <w:rFonts w:ascii="Courier New" w:hAnsi="Courier New"/>
+          <w:sz w:val="16"/>
+        </w:rPr>
+        <w:t xml:space="preserve">    push    ebx</w:t>
+      </w:r>
+    </w:p>
+    <w:p>
+      <w:pPr>
+        <w:spacing w:line="240" w:lineRule="auto" w:after="0"/>
+        <w:ind w:left="432"/>
+      </w:pPr>
+      <w:r>
+        <w:rPr>
+          <w:rFonts w:ascii="Courier New" w:hAnsi="Courier New"/>
+          <w:sz w:val="16"/>
+        </w:rPr>
+        <w:t xml:space="preserve">    mov     ebx, [stack_top]</w:t>
+      </w:r>
+    </w:p>
+    <w:p>
+      <w:pPr>
+        <w:spacing w:line="240" w:lineRule="auto" w:after="0"/>
+        <w:ind w:left="432"/>
+      </w:pPr>
+      <w:r>
+        <w:rPr>
+          <w:rFonts w:ascii="Courier New" w:hAnsi="Courier New"/>
+          <w:sz w:val="16"/>
+        </w:rPr>
+        <w:t xml:space="preserve">    test    ebx, ebx                ; empty? (test also clears CF)</w:t>
+      </w:r>
+    </w:p>
+    <w:p>
+      <w:pPr>
+        <w:spacing w:line="240" w:lineRule="auto" w:after="0"/>
+        <w:ind w:left="432"/>
+      </w:pPr>
+      <w:r>
+        <w:rPr>
+          <w:rFonts w:ascii="Courier New" w:hAnsi="Courier New"/>
+          <w:sz w:val="16"/>
+        </w:rPr>
+        <w:t xml:space="preserve">    jz      .empty</w:t>
+      </w:r>
+    </w:p>
+    <w:p>
+      <w:pPr>
+        <w:spacing w:line="240" w:lineRule="auto" w:after="0"/>
+        <w:ind w:left="432"/>
+      </w:pPr>
+      <w:r>
+        <w:rPr>
+          <w:rFonts w:ascii="Courier New" w:hAnsi="Courier New"/>
+          <w:sz w:val="16"/>
+        </w:rPr>
+        <w:t xml:space="preserve">    dec     ebx</w:t>
+      </w:r>
+    </w:p>
+    <w:p>
+      <w:pPr>
+        <w:spacing w:line="240" w:lineRule="auto" w:after="0"/>
+        <w:ind w:left="432"/>
+      </w:pPr>
+      <w:r>
+        <w:rPr>
+          <w:rFonts w:ascii="Courier New" w:hAnsi="Courier New"/>
+          <w:sz w:val="16"/>
+        </w:rPr>
+        <w:t xml:space="preserve">    mov     al, [stack_data + ebx]  ; read the most recent item</w:t>
+      </w:r>
+    </w:p>
+    <w:p>
+      <w:pPr>
+        <w:spacing w:line="240" w:lineRule="auto" w:after="0"/>
+        <w:ind w:left="432"/>
+      </w:pPr>
+      <w:r>
+        <w:rPr>
+          <w:rFonts w:ascii="Courier New" w:hAnsi="Courier New"/>
+          <w:sz w:val="16"/>
+        </w:rPr>
+        <w:t xml:space="preserve">    mov     [stack_top], ebx</w:t>
+      </w:r>
+    </w:p>
+    <w:p>
+      <w:pPr>
+        <w:spacing w:line="240" w:lineRule="auto" w:after="0"/>
+        <w:ind w:left="432"/>
+      </w:pPr>
+      <w:r>
+        <w:rPr>
+          <w:rFonts w:ascii="Courier New" w:hAnsi="Courier New"/>
+          <w:sz w:val="16"/>
+        </w:rPr>
         <w:t xml:space="preserve">    clc</w:t>
       </w:r>
     </w:p>
@@ -5718,240 +6120,6 @@
           <w:rFonts w:ascii="Courier New" w:hAnsi="Courier New"/>
           <w:sz w:val="16"/>
         </w:rPr>
-        <w:t>.full:</w:t>
-      </w:r>
-    </w:p>
-    <w:p>
-      <w:pPr>
-        <w:spacing w:line="240" w:lineRule="auto" w:after="0"/>
-        <w:ind w:left="432"/>
-      </w:pPr>
-      <w:r>
-        <w:rPr>
-          <w:rFonts w:ascii="Courier New" w:hAnsi="Courier New"/>
-          <w:sz w:val="16"/>
-        </w:rPr>
-        <w:t xml:space="preserve">    stc</w:t>
-      </w:r>
-    </w:p>
-    <w:p>
-      <w:pPr>
-        <w:spacing w:line="240" w:lineRule="auto" w:after="0"/>
-        <w:ind w:left="432"/>
-      </w:pPr>
-      <w:r>
-        <w:rPr>
-          <w:rFonts w:ascii="Courier New" w:hAnsi="Courier New"/>
-          <w:sz w:val="16"/>
-        </w:rPr>
-        <w:t xml:space="preserve">    pop     ebx</w:t>
-      </w:r>
-    </w:p>
-    <w:p>
-      <w:pPr>
-        <w:spacing w:line="240" w:lineRule="auto" w:after="0"/>
-        <w:ind w:left="432"/>
-      </w:pPr>
-      <w:r>
-        <w:rPr>
-          <w:rFonts w:ascii="Courier New" w:hAnsi="Courier New"/>
-          <w:sz w:val="16"/>
-        </w:rPr>
-        <w:t xml:space="preserve">    ret</w:t>
-      </w:r>
-    </w:p>
-    <w:p>
-      <w:pPr>
-        <w:spacing w:line="240" w:lineRule="auto" w:after="0"/>
-        <w:ind w:left="432"/>
-      </w:pPr>
-      <w:r>
-        <w:rPr>
-          <w:rFonts w:ascii="Courier New" w:hAnsi="Courier New"/>
-          <w:sz w:val="16"/>
-        </w:rPr>
-        <w:t xml:space="preserve"> </w:t>
-      </w:r>
-    </w:p>
-    <w:p>
-      <w:pPr>
-        <w:spacing w:line="240" w:lineRule="auto" w:after="0"/>
-        <w:ind w:left="432"/>
-      </w:pPr>
-      <w:r>
-        <w:rPr>
-          <w:rFonts w:ascii="Courier New" w:hAnsi="Courier New"/>
-          <w:sz w:val="16"/>
-        </w:rPr>
-        <w:t>; stack_pop: remove the top byte and return it in AL (AH is not changed).</w:t>
-      </w:r>
-    </w:p>
-    <w:p>
-      <w:pPr>
-        <w:spacing w:line="240" w:lineRule="auto" w:after="0"/>
-        <w:ind w:left="432"/>
-      </w:pPr>
-      <w:r>
-        <w:rPr>
-          <w:rFonts w:ascii="Courier New" w:hAnsi="Courier New"/>
-          <w:sz w:val="16"/>
-        </w:rPr>
-        <w:t>; Out: CF = 1 if the stack is empty (underflow), otherwise CF = 0.</w:t>
-      </w:r>
-    </w:p>
-    <w:p>
-      <w:pPr>
-        <w:spacing w:line="240" w:lineRule="auto" w:after="0"/>
-        <w:ind w:left="432"/>
-      </w:pPr>
-      <w:r>
-        <w:rPr>
-          <w:rFonts w:ascii="Courier New" w:hAnsi="Courier New"/>
-          <w:sz w:val="16"/>
-        </w:rPr>
-        <w:t>stack_pop:</w:t>
-      </w:r>
-    </w:p>
-    <w:p>
-      <w:pPr>
-        <w:spacing w:line="240" w:lineRule="auto" w:after="0"/>
-        <w:ind w:left="432"/>
-      </w:pPr>
-      <w:r>
-        <w:rPr>
-          <w:rFonts w:ascii="Courier New" w:hAnsi="Courier New"/>
-          <w:sz w:val="16"/>
-        </w:rPr>
-        <w:t xml:space="preserve">    push    ebx</w:t>
-      </w:r>
-    </w:p>
-    <w:p>
-      <w:pPr>
-        <w:spacing w:line="240" w:lineRule="auto" w:after="0"/>
-        <w:ind w:left="432"/>
-      </w:pPr>
-      <w:r>
-        <w:rPr>
-          <w:rFonts w:ascii="Courier New" w:hAnsi="Courier New"/>
-          <w:sz w:val="16"/>
-        </w:rPr>
-        <w:t xml:space="preserve">    mov     ebx, [stack_top]</w:t>
-      </w:r>
-    </w:p>
-    <w:p>
-      <w:pPr>
-        <w:spacing w:line="240" w:lineRule="auto" w:after="0"/>
-        <w:ind w:left="432"/>
-      </w:pPr>
-      <w:r>
-        <w:rPr>
-          <w:rFonts w:ascii="Courier New" w:hAnsi="Courier New"/>
-          <w:sz w:val="16"/>
-        </w:rPr>
-        <w:t xml:space="preserve">    test    ebx, ebx                ; empty? (test also clears CF)</w:t>
-      </w:r>
-    </w:p>
-    <w:p>
-      <w:pPr>
-        <w:spacing w:line="240" w:lineRule="auto" w:after="0"/>
-        <w:ind w:left="432"/>
-      </w:pPr>
-      <w:r>
-        <w:rPr>
-          <w:rFonts w:ascii="Courier New" w:hAnsi="Courier New"/>
-          <w:sz w:val="16"/>
-        </w:rPr>
-        <w:t xml:space="preserve">    jz      .empty</w:t>
-      </w:r>
-    </w:p>
-    <w:p>
-      <w:pPr>
-        <w:spacing w:line="240" w:lineRule="auto" w:after="0"/>
-        <w:ind w:left="432"/>
-      </w:pPr>
-      <w:r>
-        <w:rPr>
-          <w:rFonts w:ascii="Courier New" w:hAnsi="Courier New"/>
-          <w:sz w:val="16"/>
-        </w:rPr>
-        <w:t xml:space="preserve">    dec     ebx</w:t>
-      </w:r>
-    </w:p>
-    <w:p>
-      <w:pPr>
-        <w:spacing w:line="240" w:lineRule="auto" w:after="0"/>
-        <w:ind w:left="432"/>
-      </w:pPr>
-      <w:r>
-        <w:rPr>
-          <w:rFonts w:ascii="Courier New" w:hAnsi="Courier New"/>
-          <w:sz w:val="16"/>
-        </w:rPr>
-        <w:t xml:space="preserve">    mov     al, [stack_data + ebx]  ; read the most recent item</w:t>
-      </w:r>
-    </w:p>
-    <w:p>
-      <w:pPr>
-        <w:spacing w:line="240" w:lineRule="auto" w:after="0"/>
-        <w:ind w:left="432"/>
-      </w:pPr>
-      <w:r>
-        <w:rPr>
-          <w:rFonts w:ascii="Courier New" w:hAnsi="Courier New"/>
-          <w:sz w:val="16"/>
-        </w:rPr>
-        <w:t xml:space="preserve">    mov     [stack_top], ebx</w:t>
-      </w:r>
-    </w:p>
-    <w:p>
-      <w:pPr>
-        <w:spacing w:line="240" w:lineRule="auto" w:after="0"/>
-        <w:ind w:left="432"/>
-      </w:pPr>
-      <w:r>
-        <w:rPr>
-          <w:rFonts w:ascii="Courier New" w:hAnsi="Courier New"/>
-          <w:sz w:val="16"/>
-        </w:rPr>
-        <w:t xml:space="preserve">    clc</w:t>
-      </w:r>
-    </w:p>
-    <w:p>
-      <w:pPr>
-        <w:spacing w:line="240" w:lineRule="auto" w:after="0"/>
-        <w:ind w:left="432"/>
-      </w:pPr>
-      <w:r>
-        <w:rPr>
-          <w:rFonts w:ascii="Courier New" w:hAnsi="Courier New"/>
-          <w:sz w:val="16"/>
-        </w:rPr>
-        <w:t xml:space="preserve">    pop     ebx</w:t>
-      </w:r>
-    </w:p>
-    <w:p>
-      <w:pPr>
-        <w:spacing w:line="240" w:lineRule="auto" w:after="0"/>
-        <w:ind w:left="432"/>
-      </w:pPr>
-      <w:r>
-        <w:rPr>
-          <w:rFonts w:ascii="Courier New" w:hAnsi="Courier New"/>
-          <w:sz w:val="16"/>
-        </w:rPr>
-        <w:t xml:space="preserve">    ret</w:t>
-      </w:r>
-    </w:p>
-    <w:p>
-      <w:pPr>
-        <w:spacing w:line="240" w:lineRule="auto" w:after="0"/>
-        <w:ind w:left="432"/>
-      </w:pPr>
-      <w:r>
-        <w:rPr>
-          <w:rFonts w:ascii="Courier New" w:hAnsi="Courier New"/>
-          <w:sz w:val="16"/>
-        </w:rPr>
         <w:t>.empty:</w:t>
       </w:r>
     </w:p>
@@ -5965,7 +6133,7 @@
           <w:rFonts w:ascii="Courier New" w:hAnsi="Courier New"/>
           <w:sz w:val="16"/>
         </w:rPr>
-        <w:t xml:space="preserve">    stc</w:t>
+        <w:t xml:space="preserve">    stc                             ; CF = 1: underflow</w:t>
       </w:r>
     </w:p>
     <w:p>
@@ -10240,7 +10408,7 @@
           <w:i w:val="0"/>
           <w:sz w:val="24"/>
         </w:rPr>
-        <w:t xml:space="preserve"> Goseeko. Archived at </w:t>
+        <w:t xml:space="preserve"> Goseeko. </w:t>
       </w:r>
       <w:hyperlink r:id="rId15">
         <w:r>
@@ -10372,7 +10540,7 @@
           <w:i w:val="0"/>
           <w:sz w:val="24"/>
         </w:rPr>
-        <w:t xml:space="preserve"> (pp. 87-118). ISTE; John Wiley &amp; Sons. </w:t>
+        <w:t xml:space="preserve"> (pp. 87–118). ISTE; John Wiley &amp; Sons. </w:t>
       </w:r>
       <w:hyperlink r:id="rId18">
         <w:r>
@@ -10395,10 +10563,19 @@
         <w:rPr>
           <w:rFonts w:ascii="Times New Roman" w:hAnsi="Times New Roman"/>
           <w:b w:val="0"/>
+          <w:i/>
+          <w:sz w:val="24"/>
+        </w:rPr>
+        <w:t>NASM assembly language tutorials</w:t>
+      </w:r>
+      <w:r>
+        <w:rPr>
+          <w:rFonts w:ascii="Times New Roman" w:hAnsi="Times New Roman"/>
+          <w:b w:val="0"/>
           <w:i w:val="0"/>
           <w:sz w:val="24"/>
         </w:rPr>
-        <w:t xml:space="preserve">NASM assembly language tutorials. (n.d.). asmtutor.com. </w:t>
+        <w:t xml:space="preserve">. (n.d.). asmtutor.com. </w:t>
       </w:r>
       <w:hyperlink r:id="rId19">
         <w:r>

</xml_diff>